<commit_message>
fix(thai-docx): mark Thai runs complex-script (<w:cs/>) — Word proofed Thai as English
w:bidi="th-TH" on every run was not enough. Measured 2026-09-24 in Windows Word 16:
the liquid-sugar leaf-filter sheet kept 119 Thai spelling flags with bidi alone, and 0
once each Thai run also carried <w:cs/>. Word itself writes Thai that way: <w:cs/> on
the Thai run, Thai and Latin in separate runs.

fix_thai_docx.py (both copies, identical):
- split runs at the Thai/Latin boundary; <w:cs/> on the Thai pieces only. Brackets and
  closing punctuation touching Thai stay in the Thai piece.
- put <w:rPr> children back in schema order (python-docx callers append bCs/szCs last).
- idempotent: a run that already has <w:cs/> is left alone.

ICHITA-Report-Template.docx re-run through it: 6 Thai flags -> 1 (Word's dictionary
splits "วรรณยุกต์"). thai-in-word.md: rule 0 (the flag) and rule 6 (order).
pytest: 61 passed.

Co-Authored-By: Claude Opus 5.5 (1M context) <noreply@anthropic.com>
</commit_message>
<xml_diff>
--- a/skills/ichita-design/office/ICHITA-Report-Template.docx
+++ b/skills/ichita-design/office/ICHITA-Report-Template.docx
@@ -9,9 +9,17 @@
       <w:r>
         <w:rPr>
           <w:rFonts w:cs="TH Aeonik Book"/>
-          <w:lang w:bidi="th-TH"/>
-        </w:rPr>
-        <w:t xml:space="preserve">รายงานผลการทดสอบ Pilot Test</w:t>
+          <w:cs/>
+          <w:lang w:bidi="th-TH"/>
+        </w:rPr>
+        <w:t xml:space="preserve">รายงานผลการทดสอบ </w:t>
+      </w:r>
+      <w:r>
+        <w:rPr>
+          <w:rFonts w:cs="TH Aeonik Book"/>
+          <w:lang w:bidi="th-TH"/>
+        </w:rPr>
+        <w:t xml:space="preserve">Pilot Test</w:t>
       </w:r>
     </w:p>
     <w:p>
@@ -58,9 +66,25 @@
       <w:r>
         <w:rPr>
           <w:rFonts w:cs="TH Aeonik Book"/>
-          <w:lang w:bidi="th-TH"/>
-        </w:rPr>
-        <w:t xml:space="preserve">ข้อความภาษาไทยใช้ขนาดตัวอักษรและระยะบรรทัดเดียวกับภาษาอังกฤษ เพราะ TH Aeonik เผื่อพื้นที่ให้สระและวรรณยุกต์ไว้ในตัวฟอนต์แล้ว</w:t>
+          <w:cs/>
+          <w:lang w:bidi="th-TH"/>
+        </w:rPr>
+        <w:t xml:space="preserve">ข้อความภาษาไทยใช้ขนาดตัวอักษรและระยะบรรทัดเดียวกับภาษาอังกฤษ เพราะ </w:t>
+      </w:r>
+      <w:r>
+        <w:rPr>
+          <w:rFonts w:cs="TH Aeonik Book"/>
+          <w:lang w:bidi="th-TH"/>
+        </w:rPr>
+        <w:t xml:space="preserve">TH Aeonik </w:t>
+      </w:r>
+      <w:r>
+        <w:rPr>
+          <w:rFonts w:cs="TH Aeonik Book"/>
+          <w:cs/>
+          <w:lang w:bidi="th-TH"/>
+        </w:rPr>
+        <w:t xml:space="preserve">เผื่อพื้นที่ให้สระและวรรณยุกต์ไว้ในตัวฟอนต์แล้ว</w:t>
       </w:r>
     </w:p>
     <w:p>
@@ -505,9 +529,32 @@
       <w:r>
         <w:rPr>
           <w:rFonts w:cs="TH Aeonik Book"/>
-          <w:lang w:bidi="th-TH"/>
-        </w:rPr>
-        <w:t xml:space="preserve">ตารางที่ 1. สภาวะการเดินระบบ / Table 1. Operating conditions.</w:t>
+          <w:cs/>
+          <w:lang w:bidi="th-TH"/>
+        </w:rPr>
+        <w:t xml:space="preserve">ตารางที่ </w:t>
+      </w:r>
+      <w:r>
+        <w:rPr>
+          <w:rFonts w:cs="TH Aeonik Book"/>
+          <w:lang w:bidi="th-TH"/>
+        </w:rPr>
+        <w:t xml:space="preserve">1. </w:t>
+      </w:r>
+      <w:r>
+        <w:rPr>
+          <w:rFonts w:cs="TH Aeonik Book"/>
+          <w:cs/>
+          <w:lang w:bidi="th-TH"/>
+        </w:rPr>
+        <w:t xml:space="preserve">สภาวะการเดินระบบ </w:t>
+      </w:r>
+      <w:r>
+        <w:rPr>
+          <w:rFonts w:cs="TH Aeonik Book"/>
+          <w:lang w:bidi="th-TH"/>
+        </w:rPr>
+        <w:t xml:space="preserve">/ Table 1. Operating conditions.</w:t>
       </w:r>
     </w:p>
     <w:p>
@@ -758,9 +805,9 @@
     <w:r>
       <w:rPr>
         <w:rFonts w:cs="TH Aeonik Book"/>
+        <w:color w:val="4F6472"/>
         <w:sz w:val="18"/>
         <w:szCs w:val="18"/>
-        <w:color w:val="4F6472"/>
         <w:lang w:bidi="th-TH"/>
       </w:rPr>
       <w:t>Document reference · Rev 1.0</w:t>
@@ -915,8 +962,8 @@
       <w:b/>
       <w:bCs/>
       <w:caps/>
+      <w:color w:val="4F6472"/>
       <w:spacing w:val="19"/>
-      <w:color w:val="4F6472"/>
       <w:sz w:val="16"/>
       <w:szCs w:val="16"/>
       <w:lang w:bidi="th-TH"/>

</xml_diff>